<commit_message>
Condense Jun 29 weekly update I4 progress bullets to 5 items
Co-Authored-By: Claude Sonnet 5 <noreply@anthropic.com>
</commit_message>
<xml_diff>
--- a/outputs/weekly-updates/Waabanong Weekly Update - Week of 2026-06-29.docx
+++ b/outputs/weekly-updates/Waabanong Weekly Update - Week of 2026-06-29.docx
@@ -25,10 +25,14 @@
         </w:rPr>
       </w:pPr>
       <w:r>
-        <w:t>Delivered July 6, 2026</w:t>
-      </w:r>
-      <w:r/>
-      <w:r/>
+        <w:t xml:space="preserve">Delivered July </w:t>
+      </w:r>
+      <w:r>
+        <w:t>9</w:t>
+      </w:r>
+      <w:r>
+        <w:t>, 2026</w:t>
+      </w:r>
     </w:p>
     <w:p>
       <w:pPr>
@@ -38,33 +42,23 @@
         </w:rPr>
       </w:pPr>
       <w:r>
-        <w:t>Week of June 29 to July 3, 2026</w:t>
-      </w:r>
-    </w:p>
-    <w:p>
-      <w:pPr>
-        <w:ind w:left="-709"/>
-        <w:rPr>
-          <w:lang w:val="en-CA"/>
-        </w:rPr>
-      </w:pPr>
-      <w:r>
-        <w:rPr>
+        <w:rPr>
+          <w:noProof/>
           <w:sz w:val="12"/>
           <w:szCs w:val="12"/>
           <w:lang w:val="en-CA"/>
         </w:rPr>
         <w:drawing>
-          <wp:anchor distT="0" distB="0" distL="114300" distR="114300" simplePos="0" relativeHeight="251658240" behindDoc="0" locked="0" layoutInCell="1" allowOverlap="1" wp14:anchorId="7AB2F647" wp14:editId="71E18F0D">
+          <wp:anchor distT="0" distB="0" distL="114300" distR="114300" simplePos="0" relativeHeight="251658240" behindDoc="0" locked="0" layoutInCell="1" allowOverlap="1" wp14:anchorId="7AB2F647" wp14:editId="37E1D660">
             <wp:simplePos x="0" y="0"/>
             <wp:positionH relativeFrom="column">
-              <wp:posOffset>-598744</wp:posOffset>
+              <wp:posOffset>-600075</wp:posOffset>
             </wp:positionH>
             <wp:positionV relativeFrom="paragraph">
-              <wp:posOffset>64773</wp:posOffset>
+              <wp:posOffset>354330</wp:posOffset>
             </wp:positionV>
-            <wp:extent cx="7194950" cy="3426057"/>
-            <wp:effectExtent l="0" t="0" r="6350" b="3175"/>
+            <wp:extent cx="7329488" cy="3490120"/>
+            <wp:effectExtent l="0" t="0" r="5080" b="0"/>
             <wp:wrapNone/>
             <wp:docPr id="1324356955" name="Picture 1" descr="The diagram illustrates a project timeline with various phases such as infrastructure setup, user authentication, client testing, case file management, data cleaning, and financial tracking, all leading up to a go-live date for a solution design and testing.&#10;&#10;AI-generated content may be incorrect."/>
             <wp:cNvGraphicFramePr>
@@ -92,7 +86,7 @@
                   <pic:spPr>
                     <a:xfrm>
                       <a:off x="0" y="0"/>
-                      <a:ext cx="7208965" cy="3432730"/>
+                      <a:ext cx="7338853" cy="3494579"/>
                     </a:xfrm>
                     <a:prstGeom prst="rect">
                       <a:avLst/>
@@ -110,6 +104,17 @@
           </wp:anchor>
         </w:drawing>
       </w:r>
+      <w:r>
+        <w:t>Week of June 29 to July 3, 2026</w:t>
+      </w:r>
+    </w:p>
+    <w:p>
+      <w:pPr>
+        <w:ind w:left="-709"/>
+        <w:rPr>
+          <w:lang w:val="en-CA"/>
+        </w:rPr>
+      </w:pPr>
     </w:p>
     <w:p>
       <w:pPr>
@@ -563,7 +568,6 @@
               <w:rPr>
                 <w:lang w:val="en-CA"/>
               </w:rPr>
-              <w:lastRenderedPageBreak/>
               <w:t>I4 - Intake Management &amp; Automated Notifications</w:t>
             </w:r>
           </w:p>
@@ -614,7 +618,6 @@
             <w:r>
               <w:t>Intake reopen workflow added; supervisor review and referral eligibility refinements</w:t>
             </w:r>
-            <w:r/>
           </w:p>
         </w:tc>
       </w:tr>
@@ -639,6 +642,7 @@
               <w:rPr>
                 <w:lang w:val="en-CA"/>
               </w:rPr>
+              <w:lastRenderedPageBreak/>
               <w:t>I5</w:t>
             </w:r>
             <w:r>
@@ -799,31 +803,6 @@
                 <w:lang w:val="en-CA"/>
               </w:rPr>
               <w:t>No activity this week</w:t>
-            </w:r>
-            <w:r>
-              <w:rPr>
-                <w:lang w:val="en-CA"/>
-              </w:rPr>
-            </w:r>
-            <w:r>
-              <w:rPr>
-                <w:lang w:val="en-CA"/>
-              </w:rPr>
-            </w:r>
-            <w:r>
-              <w:rPr>
-                <w:lang w:val="en-CA"/>
-              </w:rPr>
-            </w:r>
-            <w:r>
-              <w:rPr>
-                <w:lang w:val="en-CA"/>
-              </w:rPr>
-            </w:r>
-            <w:r>
-              <w:rPr>
-                <w:lang w:val="en-CA"/>
-              </w:rPr>
             </w:r>
           </w:p>
         </w:tc>
@@ -1041,7 +1020,6 @@
             <w:pPr>
               <w:cnfStyle w:val="000000100000" w:firstRow="0" w:lastRow="0" w:firstColumn="0" w:lastColumn="0" w:oddVBand="0" w:evenVBand="0" w:oddHBand="1" w:evenHBand="0" w:firstRowFirstColumn="0" w:firstRowLastColumn="0" w:lastRowFirstColumn="0" w:lastRowLastColumn="0"/>
             </w:pPr>
-            <w:r/>
           </w:p>
         </w:tc>
         <w:tc>
@@ -1052,7 +1030,6 @@
             <w:pPr>
               <w:cnfStyle w:val="000000100000" w:firstRow="0" w:lastRow="0" w:firstColumn="0" w:lastColumn="0" w:oddVBand="0" w:evenVBand="0" w:oddHBand="1" w:evenHBand="0" w:firstRowFirstColumn="0" w:firstRowLastColumn="0" w:lastRowFirstColumn="0" w:lastRowLastColumn="0"/>
             </w:pPr>
-            <w:r/>
           </w:p>
         </w:tc>
       </w:tr>
@@ -1171,6 +1148,86 @@
         <w:t>Minor housekeeping: search card UI fix and an internal seeder typo correction.</w:t>
       </w:r>
     </w:p>
+    <w:p>
+      <w:pPr>
+        <w:pStyle w:val="list1"/>
+        <w:numPr>
+          <w:ilvl w:val="0"/>
+          <w:numId w:val="0"/>
+        </w:numPr>
+        <w:spacing w:after="360"/>
+        <w:ind w:left="720"/>
+      </w:pPr>
+    </w:p>
+    <w:p>
+      <w:pPr>
+        <w:pStyle w:val="list1"/>
+        <w:numPr>
+          <w:ilvl w:val="0"/>
+          <w:numId w:val="0"/>
+        </w:numPr>
+        <w:spacing w:after="360"/>
+        <w:ind w:left="720"/>
+      </w:pPr>
+    </w:p>
+    <w:p>
+      <w:pPr>
+        <w:pStyle w:val="list1"/>
+        <w:numPr>
+          <w:ilvl w:val="0"/>
+          <w:numId w:val="0"/>
+        </w:numPr>
+        <w:spacing w:after="360"/>
+        <w:ind w:left="720"/>
+      </w:pPr>
+    </w:p>
+    <w:p>
+      <w:pPr>
+        <w:pStyle w:val="list1"/>
+        <w:numPr>
+          <w:ilvl w:val="0"/>
+          <w:numId w:val="0"/>
+        </w:numPr>
+        <w:spacing w:after="360"/>
+        <w:ind w:left="720"/>
+      </w:pPr>
+    </w:p>
+    <w:p>
+      <w:pPr>
+        <w:pStyle w:val="list1"/>
+        <w:numPr>
+          <w:ilvl w:val="0"/>
+          <w:numId w:val="0"/>
+        </w:numPr>
+        <w:spacing w:after="360"/>
+        <w:ind w:left="720"/>
+      </w:pPr>
+    </w:p>
+    <w:p>
+      <w:pPr>
+        <w:pStyle w:val="list1"/>
+        <w:numPr>
+          <w:ilvl w:val="0"/>
+          <w:numId w:val="0"/>
+        </w:numPr>
+        <w:spacing w:after="360"/>
+        <w:ind w:left="720"/>
+      </w:pPr>
+    </w:p>
+    <w:p>
+      <w:pPr>
+        <w:pStyle w:val="list1"/>
+        <w:numPr>
+          <w:ilvl w:val="0"/>
+          <w:numId w:val="0"/>
+        </w:numPr>
+        <w:spacing w:after="360"/>
+        <w:ind w:left="720"/>
+        <w:rPr>
+          <w:lang w:val="en-CA"/>
+        </w:rPr>
+      </w:pPr>
+    </w:p>
     <w:tbl>
       <w:tblPr>
         <w:tblStyle w:val="LightList-Accent2"/>
@@ -1207,7 +1264,6 @@
                 <w:color w:val="FFFFFF" w:themeColor="background1"/>
                 <w:lang w:val="en-CA"/>
               </w:rPr>
-              <w:lastRenderedPageBreak/>
               <w:t>I1 - System Infrastructure &amp; Environments</w:t>
             </w:r>
           </w:p>
@@ -1283,8 +1339,25 @@
         </w:rPr>
       </w:pPr>
       <w:r>
-        <w:t>Footer version bump (twice this week, Jun 29 and Jul 3); no functional infrastructure changes.</w:t>
-      </w:r>
+        <w:t>N</w:t>
+      </w:r>
+      <w:r>
+        <w:t>o functional infrastructure changes.</w:t>
+      </w:r>
+    </w:p>
+    <w:p>
+      <w:pPr>
+        <w:pStyle w:val="list1"/>
+        <w:numPr>
+          <w:ilvl w:val="0"/>
+          <w:numId w:val="0"/>
+        </w:numPr>
+        <w:spacing w:after="360"/>
+        <w:ind w:left="720"/>
+        <w:rPr>
+          <w:lang w:val="en-CA"/>
+        </w:rPr>
+      </w:pPr>
     </w:p>
     <w:tbl>
       <w:tblPr>
@@ -1415,8 +1488,25 @@
         </w:rPr>
       </w:pPr>
       <w:r>
+        <w:t xml:space="preserve">Complete. </w:t>
+      </w:r>
+      <w:r>
         <w:t>No authentication changes this week.</w:t>
       </w:r>
+    </w:p>
+    <w:p>
+      <w:pPr>
+        <w:pStyle w:val="list1"/>
+        <w:numPr>
+          <w:ilvl w:val="0"/>
+          <w:numId w:val="0"/>
+        </w:numPr>
+        <w:spacing w:after="360"/>
+        <w:ind w:left="720" w:hanging="360"/>
+        <w:rPr>
+          <w:lang w:val="en-CA"/>
+        </w:rPr>
+      </w:pPr>
     </w:p>
     <w:tbl>
       <w:tblPr>
@@ -1666,6 +1756,42 @@
         <w:t>General relationship-data updates.</w:t>
       </w:r>
     </w:p>
+    <w:p>
+      <w:pPr>
+        <w:pStyle w:val="list1"/>
+        <w:numPr>
+          <w:ilvl w:val="0"/>
+          <w:numId w:val="0"/>
+        </w:numPr>
+        <w:spacing w:after="360"/>
+        <w:ind w:left="720"/>
+      </w:pPr>
+    </w:p>
+    <w:p>
+      <w:pPr>
+        <w:pStyle w:val="list1"/>
+        <w:numPr>
+          <w:ilvl w:val="0"/>
+          <w:numId w:val="0"/>
+        </w:numPr>
+        <w:spacing w:after="360"/>
+        <w:ind w:left="720"/>
+      </w:pPr>
+    </w:p>
+    <w:p>
+      <w:pPr>
+        <w:pStyle w:val="list1"/>
+        <w:numPr>
+          <w:ilvl w:val="0"/>
+          <w:numId w:val="0"/>
+        </w:numPr>
+        <w:spacing w:after="360"/>
+        <w:ind w:left="720"/>
+        <w:rPr>
+          <w:lang w:val="en-CA"/>
+        </w:rPr>
+      </w:pPr>
+    </w:p>
     <w:tbl>
       <w:tblPr>
         <w:tblStyle w:val="LightList-Accent2"/>
@@ -1702,6 +1828,7 @@
                 <w:color w:val="FFFFFF" w:themeColor="background1"/>
                 <w:lang w:val="en-CA"/>
               </w:rPr>
+              <w:lastRenderedPageBreak/>
               <w:t>I4 - Intake Management &amp; Automated Notifications</w:t>
             </w:r>
           </w:p>
@@ -1953,155 +2080,16 @@
     <w:p>
       <w:pPr>
         <w:pStyle w:val="list1"/>
-        <w:rPr>
-          <w:lang w:val="en-CA"/>
-        </w:rPr>
-      </w:pPr>
-      <w:r>
-        <w:t>Significant intake work this week:</w:t>
-      </w:r>
-    </w:p>
-    <w:p>
-      <w:pPr>
-        <w:pStyle w:val="list1"/>
-        <w:rPr>
-          <w:lang w:val="en-CA"/>
-        </w:rPr>
-        <w:ind w:left="720"/>
-      </w:pPr>
-      <w:r>
-        <w:t>**Intake reopen workflow added** — new routes, admin modals, review banners, and task migration to support reopening a closed intake</w:t>
-      </w:r>
-    </w:p>
-    <w:p>
-      <w:pPr>
-        <w:pStyle w:val="list1"/>
-        <w:rPr>
-          <w:lang w:val="en-CA"/>
-        </w:rPr>
-        <w:ind w:left="720"/>
-      </w:pPr>
-      <w:r>
-        <w:t>Workers can now add multiple people to an intake directly from the genogram</w:t>
-      </w:r>
-    </w:p>
-    <w:p>
-      <w:pPr>
-        <w:pStyle w:val="list1"/>
-        <w:rPr>
-          <w:lang w:val="en-CA"/>
-        </w:rPr>
-        <w:ind w:left="720"/>
-      </w:pPr>
-      <w:r>
-        <w:t>Added the option to reassign an intake to a different worker</w:t>
-      </w:r>
-    </w:p>
-    <w:p>
-      <w:pPr>
-        <w:pStyle w:val="list1"/>
-        <w:rPr>
-          <w:lang w:val="en-CA"/>
-        </w:rPr>
-        <w:ind w:left="720"/>
-      </w:pPr>
-      <w:r>
-        <w:t>Supervisor Review: JavaScript cleanup, new "Additional Info" checkbox, simplified task layout, and removal of an unused task-saving route</w:t>
-      </w:r>
-    </w:p>
-    <w:p>
-      <w:pPr>
-        <w:pStyle w:val="list1"/>
-        <w:rPr>
-          <w:lang w:val="en-CA"/>
-        </w:rPr>
-        <w:ind w:left="720"/>
-      </w:pPr>
-      <w:r>
-        <w:t>Supervisor Review permissions extended to include the Admin role</w:t>
-      </w:r>
-    </w:p>
-    <w:p>
-      <w:pPr>
-        <w:pStyle w:val="list1"/>
-        <w:rPr>
-          <w:lang w:val="en-CA"/>
-        </w:rPr>
-        <w:ind w:left="720"/>
-      </w:pPr>
-      <w:r>
-        <w:t>Prior contact check logic updated (two rounds of fixes)</w:t>
-      </w:r>
-    </w:p>
-    <w:p>
-      <w:pPr>
-        <w:pStyle w:val="list1"/>
-        <w:rPr>
-          <w:lang w:val="en-CA"/>
-        </w:rPr>
-        <w:ind w:left="720"/>
-      </w:pPr>
-      <w:r>
-        <w:t>Updated Non-Family Connection role labels in intake referral eligibility</w:t>
-      </w:r>
-    </w:p>
-    <w:p>
-      <w:pPr>
-        <w:pStyle w:val="list1"/>
-        <w:rPr>
-          <w:lang w:val="en-CA"/>
-        </w:rPr>
-        <w:ind w:left="720"/>
-      </w:pPr>
-      <w:r>
-        <w:t>Intake fields remain editable after case closure when an Admin is making the edit</w:t>
-      </w:r>
-    </w:p>
-    <w:p>
-      <w:pPr>
-        <w:pStyle w:val="list1"/>
-        <w:rPr>
-          <w:lang w:val="en-CA"/>
-        </w:rPr>
-        <w:ind w:left="720"/>
-      </w:pPr>
-      <w:r>
-        <w:t>Updated validation rules for issue subcategory IDs on intake referral requests</w:t>
-      </w:r>
-    </w:p>
-    <w:p>
-      <w:pPr>
-        <w:pStyle w:val="list1"/>
-        <w:rPr>
-          <w:lang w:val="en-CA"/>
-        </w:rPr>
-        <w:ind w:left="720"/>
-      </w:pPr>
-      <w:r>
-        <w:t>Fixed a modal overflow issue during intake reassignment that was hiding the focus ring</w:t>
-      </w:r>
-    </w:p>
-    <w:p>
-      <w:pPr>
-        <w:pStyle w:val="list1"/>
-        <w:rPr>
-          <w:lang w:val="en-CA"/>
-        </w:rPr>
-        <w:ind w:left="720"/>
-      </w:pPr>
-      <w:r>
-        <w:t>Added "pending closure" as an advanced search filter option</w:t>
-      </w:r>
-    </w:p>
-    <w:p>
-      <w:pPr>
-        <w:pStyle w:val="list1"/>
-        <w:rPr>
-          <w:lang w:val="en-CA"/>
-        </w:rPr>
-      </w:pPr>
-      <w:r>
-        <w:t>Worked on intake issue categories and response-time handling.</w:t>
+        <w:spacing w:after="360"/>
+        <w:rPr>
+          <w:lang w:val="en-CA"/>
+        </w:rPr>
+      </w:pPr>
+      <w:r>
+        <w:rPr>
+          <w:lang w:val="en-CA"/>
+        </w:rPr>
+        <w:t>Intake reopen workflow added — new routes, admin modals, review banners, and task migration to support reopening a closed intake</w:t>
       </w:r>
     </w:p>
     <w:p>
@@ -2113,8 +2101,98 @@
         </w:rPr>
       </w:pPr>
       <w:r>
-        <w:t>Ross Gillingham requested a follow-up session to review Intake Module workflow changes and additional triggers, after meeting with Darryl on his first day back (Jun 29); session to be scheduled.</w:t>
-      </w:r>
+        <w:rPr>
+          <w:lang w:val="en-CA"/>
+        </w:rPr>
+        <w:t xml:space="preserve">Supervisor Review improvements: JavaScript cleanup, new "Additional Info" checkbox, simplified task layout, and permissions extended to include the </w:t>
+      </w:r>
+      <w:proofErr w:type="gramStart"/>
+      <w:r>
+        <w:rPr>
+          <w:lang w:val="en-CA"/>
+        </w:rPr>
+        <w:t>Admin</w:t>
+      </w:r>
+      <w:proofErr w:type="gramEnd"/>
+      <w:r>
+        <w:rPr>
+          <w:lang w:val="en-CA"/>
+        </w:rPr>
+        <w:t xml:space="preserve"> role</w:t>
+      </w:r>
+    </w:p>
+    <w:p>
+      <w:pPr>
+        <w:pStyle w:val="list1"/>
+        <w:spacing w:after="360"/>
+        <w:rPr>
+          <w:lang w:val="en-CA"/>
+        </w:rPr>
+      </w:pPr>
+      <w:r>
+        <w:rPr>
+          <w:lang w:val="en-CA"/>
+        </w:rPr>
+        <w:t>Intake reassignment: added the option to reassign an intake to a different worker; fixed a modal overflow issue that was hiding the focus ring</w:t>
+      </w:r>
+    </w:p>
+    <w:p>
+      <w:pPr>
+        <w:pStyle w:val="list1"/>
+        <w:spacing w:after="360"/>
+        <w:rPr>
+          <w:lang w:val="en-CA"/>
+        </w:rPr>
+      </w:pPr>
+      <w:r>
+        <w:rPr>
+          <w:lang w:val="en-CA"/>
+        </w:rPr>
+        <w:t>Smaller refinements: multi-add people to an intake from the genogram, prior contact check fixes, updated referral eligibility labels and validation rules, fields remain editable after closure for Admins, "pending closure" added as a search filter, and continued work on issue categories/response-time handling</w:t>
+      </w:r>
+    </w:p>
+    <w:p>
+      <w:pPr>
+        <w:pStyle w:val="list1"/>
+        <w:spacing w:after="360"/>
+        <w:rPr>
+          <w:lang w:val="en-CA"/>
+        </w:rPr>
+      </w:pPr>
+      <w:r>
+        <w:rPr>
+          <w:lang w:val="en-CA"/>
+        </w:rPr>
+        <w:t>Ross Gillingham requested a follow-up session to review Intake Module workflow changes and additional triggers, after meeting with Darryl on his first day back (Jun 29); session to be scheduled</w:t>
+      </w:r>
+    </w:p>
+    <w:p>
+      <w:pPr>
+        <w:spacing w:before="0" w:after="160" w:line="278" w:lineRule="auto"/>
+        <w:rPr>
+          <w:lang w:val="en-CA"/>
+        </w:rPr>
+      </w:pPr>
+      <w:r>
+        <w:rPr>
+          <w:lang w:val="en-CA"/>
+        </w:rPr>
+        <w:br w:type="page"/>
+      </w:r>
+    </w:p>
+    <w:p>
+      <w:pPr>
+        <w:pStyle w:val="list1"/>
+        <w:numPr>
+          <w:ilvl w:val="0"/>
+          <w:numId w:val="0"/>
+        </w:numPr>
+        <w:spacing w:after="360"/>
+        <w:ind w:left="720"/>
+        <w:rPr>
+          <w:lang w:val="en-CA"/>
+        </w:rPr>
+      </w:pPr>
     </w:p>
     <w:tbl>
       <w:tblPr>
@@ -2196,7 +2274,6 @@
                 <w:bCs/>
                 <w:lang w:val="en-CA"/>
               </w:rPr>
-              <w:lastRenderedPageBreak/>
               <w:t>Features</w:t>
             </w:r>
           </w:p>
@@ -2482,10 +2559,13 @@
     <w:p>
       <w:pPr>
         <w:pStyle w:val="list1"/>
-        <w:rPr>
-          <w:lang w:val="en-CA"/>
-        </w:rPr>
-        <w:ind w:left="720"/>
+        <w:numPr>
+          <w:ilvl w:val="1"/>
+          <w:numId w:val="8"/>
+        </w:numPr>
+        <w:rPr>
+          <w:lang w:val="en-CA"/>
+        </w:rPr>
       </w:pPr>
       <w:r>
         <w:t>General bug fixes across the legal status modal</w:t>
@@ -2494,10 +2574,13 @@
     <w:p>
       <w:pPr>
         <w:pStyle w:val="list1"/>
-        <w:rPr>
-          <w:lang w:val="en-CA"/>
-        </w:rPr>
-        <w:ind w:left="720"/>
+        <w:numPr>
+          <w:ilvl w:val="1"/>
+          <w:numId w:val="8"/>
+        </w:numPr>
+        <w:rPr>
+          <w:lang w:val="en-CA"/>
+        </w:rPr>
       </w:pPr>
       <w:r>
         <w:t>Edit mode now correctly pre-selects the existing legal status type</w:t>
@@ -2506,10 +2589,13 @@
     <w:p>
       <w:pPr>
         <w:pStyle w:val="list1"/>
-        <w:rPr>
-          <w:lang w:val="en-CA"/>
-        </w:rPr>
-        <w:ind w:left="720"/>
+        <w:numPr>
+          <w:ilvl w:val="1"/>
+          <w:numId w:val="8"/>
+        </w:numPr>
+        <w:rPr>
+          <w:lang w:val="en-CA"/>
+        </w:rPr>
       </w:pPr>
       <w:r>
         <w:t>Fixed: replacing a document in the legal status modal was not replacing the prior version</w:t>
@@ -2518,10 +2604,13 @@
     <w:p>
       <w:pPr>
         <w:pStyle w:val="list1"/>
-        <w:rPr>
-          <w:lang w:val="en-CA"/>
-        </w:rPr>
-        <w:ind w:left="720"/>
+        <w:numPr>
+          <w:ilvl w:val="1"/>
+          <w:numId w:val="8"/>
+        </w:numPr>
+        <w:rPr>
+          <w:lang w:val="en-CA"/>
+        </w:rPr>
       </w:pPr>
       <w:r>
         <w:t>Legal status and placements now included in the case log</w:t>
@@ -2533,10 +2622,17 @@
         <w:rPr>
           <w:lang w:val="en-CA"/>
         </w:rPr>
-        <w:ind w:left="720"/>
-      </w:pPr>
-      <w:r>
-        <w:t>Placements tab: legal status now correctly links to the existing document rather than prompting an upload</w:t>
+      </w:pPr>
+      <w:r>
+        <w:t xml:space="preserve">Placements </w:t>
+      </w:r>
+      <w:proofErr w:type="gramStart"/>
+      <w:r>
+        <w:t>tab:</w:t>
+      </w:r>
+      <w:proofErr w:type="gramEnd"/>
+      <w:r>
+        <w:t xml:space="preserve"> legal status now correctly links to the existing document rather than prompting an upload</w:t>
       </w:r>
     </w:p>
     <w:p>
@@ -2553,10 +2649,13 @@
     <w:p>
       <w:pPr>
         <w:pStyle w:val="list1"/>
-        <w:rPr>
-          <w:lang w:val="en-CA"/>
-        </w:rPr>
-        <w:ind w:left="720"/>
+        <w:numPr>
+          <w:ilvl w:val="1"/>
+          <w:numId w:val="8"/>
+        </w:numPr>
+        <w:rPr>
+          <w:lang w:val="en-CA"/>
+        </w:rPr>
       </w:pPr>
       <w:r>
         <w:t>Close date validation added to the new placement modal</w:t>
@@ -2565,10 +2664,13 @@
     <w:p>
       <w:pPr>
         <w:pStyle w:val="list1"/>
-        <w:rPr>
-          <w:lang w:val="en-CA"/>
-        </w:rPr>
-        <w:ind w:left="720"/>
+        <w:numPr>
+          <w:ilvl w:val="1"/>
+          <w:numId w:val="8"/>
+        </w:numPr>
+        <w:rPr>
+          <w:lang w:val="en-CA"/>
+        </w:rPr>
       </w:pPr>
       <w:r>
         <w:t>Additional fields added for placement type</w:t>
@@ -2577,10 +2679,13 @@
     <w:p>
       <w:pPr>
         <w:pStyle w:val="list1"/>
-        <w:rPr>
-          <w:lang w:val="en-CA"/>
-        </w:rPr>
-        <w:ind w:left="720"/>
+        <w:numPr>
+          <w:ilvl w:val="1"/>
+          <w:numId w:val="8"/>
+        </w:numPr>
+        <w:rPr>
+          <w:lang w:val="en-CA"/>
+        </w:rPr>
       </w:pPr>
       <w:r>
         <w:t>Case file placement address fields now match the Person Profile address fields</w:t>
@@ -2589,10 +2694,13 @@
     <w:p>
       <w:pPr>
         <w:pStyle w:val="list1"/>
-        <w:rPr>
-          <w:lang w:val="en-CA"/>
-        </w:rPr>
-        <w:ind w:left="720"/>
+        <w:numPr>
+          <w:ilvl w:val="1"/>
+          <w:numId w:val="8"/>
+        </w:numPr>
+        <w:rPr>
+          <w:lang w:val="en-CA"/>
+        </w:rPr>
       </w:pPr>
       <w:r>
         <w:t>Placement Resource Homes now appear correctly in current households</w:t>
@@ -2612,13 +2720,24 @@
     <w:p>
       <w:pPr>
         <w:pStyle w:val="list1"/>
-        <w:rPr>
-          <w:lang w:val="en-CA"/>
-        </w:rPr>
-        <w:ind w:left="720"/>
-      </w:pPr>
-      <w:r>
-        <w:t>Case note logs now capture when a person is added to or removed from a case</w:t>
+        <w:numPr>
+          <w:ilvl w:val="1"/>
+          <w:numId w:val="8"/>
+        </w:numPr>
+        <w:rPr>
+          <w:lang w:val="en-CA"/>
+        </w:rPr>
+      </w:pPr>
+      <w:r>
+        <w:t xml:space="preserve">Case </w:t>
+      </w:r>
+      <w:proofErr w:type="gramStart"/>
+      <w:r>
+        <w:t>note</w:t>
+      </w:r>
+      <w:proofErr w:type="gramEnd"/>
+      <w:r>
+        <w:t xml:space="preserve"> logs now capture when a person is added to or removed from a case</w:t>
       </w:r>
     </w:p>
     <w:p>
@@ -2627,9 +2746,9 @@
         <w:rPr>
           <w:lang w:val="en-CA"/>
         </w:rPr>
-        <w:ind w:left="720"/>
-      </w:pPr>
-      <w:r>
+      </w:pPr>
+      <w:r>
+        <w:lastRenderedPageBreak/>
         <w:t>Fixed a special-characters issue in case notes</w:t>
       </w:r>
     </w:p>
@@ -2677,6 +2796,20 @@
       <w:r>
         <w:t>Added an "All" option to Stage 3 of the Existing Case File modal</w:t>
       </w:r>
+    </w:p>
+    <w:p>
+      <w:pPr>
+        <w:pStyle w:val="list1"/>
+        <w:numPr>
+          <w:ilvl w:val="0"/>
+          <w:numId w:val="0"/>
+        </w:numPr>
+        <w:spacing w:after="360"/>
+        <w:ind w:left="720"/>
+        <w:rPr>
+          <w:lang w:val="en-CA"/>
+        </w:rPr>
+      </w:pPr>
     </w:p>
     <w:bookmarkEnd w:id="0"/>
     <w:bookmarkEnd w:id="1"/>
@@ -2891,6 +3024,20 @@
         <w:t>No new developments this week; solution design continues.</w:t>
       </w:r>
     </w:p>
+    <w:p>
+      <w:pPr>
+        <w:pStyle w:val="list1"/>
+        <w:numPr>
+          <w:ilvl w:val="0"/>
+          <w:numId w:val="0"/>
+        </w:numPr>
+        <w:spacing w:after="360"/>
+        <w:ind w:left="720"/>
+        <w:rPr>
+          <w:lang w:val="en-CA"/>
+        </w:rPr>
+      </w:pPr>
+    </w:p>
     <w:tbl>
       <w:tblPr>
         <w:tblStyle w:val="LightList-Accent2"/>
@@ -2957,7 +3104,6 @@
                 <w:bCs/>
                 <w:lang w:val="en-CA"/>
               </w:rPr>
-              <w:lastRenderedPageBreak/>
               <w:t>Features</w:t>
             </w:r>
           </w:p>
@@ -3057,8 +3203,13 @@
           <w:lang w:val="en-CA"/>
         </w:rPr>
       </w:pPr>
-      <w:r>
-        <w:t>FAMCare schema access and export coordination underway with PCFS and their IT vendor (Campfire):</w:t>
+      <w:proofErr w:type="gramStart"/>
+      <w:r>
+        <w:t>FAMCare schema</w:t>
+      </w:r>
+      <w:proofErr w:type="gramEnd"/>
+      <w:r>
+        <w:t xml:space="preserve"> access and export coordination underway with PCFS and their Campfire</w:t>
       </w:r>
     </w:p>
     <w:p>
@@ -3067,8 +3218,10 @@
         <w:rPr>
           <w:lang w:val="en-CA"/>
         </w:rPr>
-        <w:ind w:left="720"/>
-      </w:pPr>
+      </w:pPr>
+      <w:r>
+        <w:t xml:space="preserve">Some delays, </w:t>
+      </w:r>
       <w:r>
         <w:t>IDFusion (Varun) granted access to a SQL Dev environment and the FAMCare test database (Jun 29–30)</w:t>
       </w:r>
@@ -3079,7 +3232,6 @@
         <w:rPr>
           <w:lang w:val="en-CA"/>
         </w:rPr>
-        <w:ind w:left="720"/>
       </w:pPr>
       <w:r>
         <w:t>Initial schema export received (Jun 30) but was not schema-only as expected; Varun identified the correct export method (SQL Server Management Studio → Generate Scripts → script entire database, with Indexes and Foreign Keys enabled, "Schema only" data option) and requested a corrected export</w:t>
@@ -3091,10 +3243,16 @@
         <w:rPr>
           <w:lang w:val="en-CA"/>
         </w:rPr>
-        <w:ind w:left="720"/>
-      </w:pPr>
-      <w:r>
-        <w:t>Database assessed as complex — roughly 200 tables with inconsistent naming and structure; Ross and Varun began manually mapping tables; PCFS also identified additional data they want carried into the new system that isn't in the current export</w:t>
+      </w:pPr>
+      <w:r>
+        <w:lastRenderedPageBreak/>
+        <w:t xml:space="preserve">Database </w:t>
+      </w:r>
+      <w:r>
+        <w:t>structure is</w:t>
+      </w:r>
+      <w:r>
+        <w:t xml:space="preserve"> complex — roughly 200 tables with inconsistent naming and structure; Ross and Varun began manually mapping tables; PCFS also identified additional data they want carried into the new system that isn't in the current export</w:t>
       </w:r>
     </w:p>
     <w:p>
@@ -3103,7 +3261,6 @@
         <w:rPr>
           <w:lang w:val="en-CA"/>
         </w:rPr>
-        <w:ind w:left="720"/>
       </w:pPr>
       <w:r>
         <w:t>PCFS's team is meeting internally this week to confirm exactly what needs to be exported</w:t>
@@ -3116,11 +3273,43 @@
         <w:rPr>
           <w:lang w:val="en-CA"/>
         </w:rPr>
+      </w:pPr>
+      <w:r>
+        <w:t xml:space="preserve">Access to live (scrubbed) production data has been requested, needed to confirm what data PCFS </w:t>
+      </w:r>
+      <w:proofErr w:type="gramStart"/>
+      <w:r>
+        <w:t>actually uses</w:t>
+      </w:r>
+      <w:proofErr w:type="gramEnd"/>
+      <w:r>
+        <w:t xml:space="preserve"> before migration scripts are finalized — targeted within two weeks</w:t>
+      </w:r>
+    </w:p>
+    <w:p>
+      <w:pPr>
+        <w:pStyle w:val="list1"/>
+        <w:numPr>
+          <w:ilvl w:val="0"/>
+          <w:numId w:val="0"/>
+        </w:numPr>
+        <w:spacing w:after="360"/>
         <w:ind w:left="720"/>
       </w:pPr>
-      <w:r>
-        <w:t>Access to live (scrubbed) production data has been requested, needed to confirm what data PCFS actually uses in practice before migration scripts are finalized — targeted within two weeks</w:t>
-      </w:r>
+    </w:p>
+    <w:p>
+      <w:pPr>
+        <w:pStyle w:val="list1"/>
+        <w:numPr>
+          <w:ilvl w:val="0"/>
+          <w:numId w:val="0"/>
+        </w:numPr>
+        <w:spacing w:after="360"/>
+        <w:ind w:left="720"/>
+        <w:rPr>
+          <w:lang w:val="en-CA"/>
+        </w:rPr>
+      </w:pPr>
     </w:p>
     <w:tbl>
       <w:tblPr>
@@ -3184,7 +3373,7 @@
               <w:rPr>
                 <w:lang w:val="en-CA"/>
               </w:rPr>
-              <w:t>Features (Potential scope may include)</w:t>
+              <w:t xml:space="preserve">Features </w:t>
             </w:r>
           </w:p>
           <w:p>
@@ -3286,8 +3475,34 @@
         </w:rPr>
       </w:pPr>
       <w:r>
-        <w:t>No new activity this week; finance module remains in solution design pending Rob's documentation review and a follow-up session.</w:t>
-      </w:r>
+        <w:t>Finance form and PO wireframes were presented to the Finance team.</w:t>
+      </w:r>
+    </w:p>
+    <w:p>
+      <w:pPr>
+        <w:pStyle w:val="list1"/>
+        <w:spacing w:after="360"/>
+        <w:rPr>
+          <w:lang w:val="en-CA"/>
+        </w:rPr>
+      </w:pPr>
+      <w:r>
+        <w:t>New draft in progress based on that feedback</w:t>
+      </w:r>
+    </w:p>
+    <w:p>
+      <w:pPr>
+        <w:pStyle w:val="list1"/>
+        <w:numPr>
+          <w:ilvl w:val="0"/>
+          <w:numId w:val="0"/>
+        </w:numPr>
+        <w:spacing w:after="360"/>
+        <w:ind w:left="720"/>
+        <w:rPr>
+          <w:lang w:val="en-CA"/>
+        </w:rPr>
+      </w:pPr>
     </w:p>
     <w:tbl>
       <w:tblPr>
@@ -3944,6 +4159,155 @@
     </w:lvl>
   </w:abstractNum>
   <w:abstractNum w:abstractNumId="2" w15:restartNumberingAfterBreak="0">
+    <w:nsid w:val="59E56530"/>
+    <w:multiLevelType w:val="multilevel"/>
+    <w:tmpl w:val="698EDD7A"/>
+    <w:lvl w:ilvl="0">
+      <w:start w:val="1"/>
+      <w:numFmt w:val="bullet"/>
+      <w:lvlText w:val=""/>
+      <w:lvlJc w:val="left"/>
+      <w:pPr>
+        <w:tabs>
+          <w:tab w:val="num" w:pos="720"/>
+        </w:tabs>
+        <w:ind w:left="720" w:hanging="360"/>
+      </w:pPr>
+      <w:rPr>
+        <w:rFonts w:ascii="Symbol" w:hAnsi="Symbol" w:hint="default"/>
+        <w:sz w:val="20"/>
+      </w:rPr>
+    </w:lvl>
+    <w:lvl w:ilvl="1" w:tentative="1">
+      <w:start w:val="1"/>
+      <w:numFmt w:val="bullet"/>
+      <w:lvlText w:val="o"/>
+      <w:lvlJc w:val="left"/>
+      <w:pPr>
+        <w:tabs>
+          <w:tab w:val="num" w:pos="1440"/>
+        </w:tabs>
+        <w:ind w:left="1440" w:hanging="360"/>
+      </w:pPr>
+      <w:rPr>
+        <w:rFonts w:ascii="Courier New" w:hAnsi="Courier New" w:hint="default"/>
+        <w:sz w:val="20"/>
+      </w:rPr>
+    </w:lvl>
+    <w:lvl w:ilvl="2" w:tentative="1">
+      <w:start w:val="1"/>
+      <w:numFmt w:val="bullet"/>
+      <w:lvlText w:val=""/>
+      <w:lvlJc w:val="left"/>
+      <w:pPr>
+        <w:tabs>
+          <w:tab w:val="num" w:pos="2160"/>
+        </w:tabs>
+        <w:ind w:left="2160" w:hanging="360"/>
+      </w:pPr>
+      <w:rPr>
+        <w:rFonts w:ascii="Wingdings" w:hAnsi="Wingdings" w:hint="default"/>
+        <w:sz w:val="20"/>
+      </w:rPr>
+    </w:lvl>
+    <w:lvl w:ilvl="3" w:tentative="1">
+      <w:start w:val="1"/>
+      <w:numFmt w:val="bullet"/>
+      <w:lvlText w:val=""/>
+      <w:lvlJc w:val="left"/>
+      <w:pPr>
+        <w:tabs>
+          <w:tab w:val="num" w:pos="2880"/>
+        </w:tabs>
+        <w:ind w:left="2880" w:hanging="360"/>
+      </w:pPr>
+      <w:rPr>
+        <w:rFonts w:ascii="Wingdings" w:hAnsi="Wingdings" w:hint="default"/>
+        <w:sz w:val="20"/>
+      </w:rPr>
+    </w:lvl>
+    <w:lvl w:ilvl="4" w:tentative="1">
+      <w:start w:val="1"/>
+      <w:numFmt w:val="bullet"/>
+      <w:lvlText w:val=""/>
+      <w:lvlJc w:val="left"/>
+      <w:pPr>
+        <w:tabs>
+          <w:tab w:val="num" w:pos="3600"/>
+        </w:tabs>
+        <w:ind w:left="3600" w:hanging="360"/>
+      </w:pPr>
+      <w:rPr>
+        <w:rFonts w:ascii="Wingdings" w:hAnsi="Wingdings" w:hint="default"/>
+        <w:sz w:val="20"/>
+      </w:rPr>
+    </w:lvl>
+    <w:lvl w:ilvl="5" w:tentative="1">
+      <w:start w:val="1"/>
+      <w:numFmt w:val="bullet"/>
+      <w:lvlText w:val=""/>
+      <w:lvlJc w:val="left"/>
+      <w:pPr>
+        <w:tabs>
+          <w:tab w:val="num" w:pos="4320"/>
+        </w:tabs>
+        <w:ind w:left="4320" w:hanging="360"/>
+      </w:pPr>
+      <w:rPr>
+        <w:rFonts w:ascii="Wingdings" w:hAnsi="Wingdings" w:hint="default"/>
+        <w:sz w:val="20"/>
+      </w:rPr>
+    </w:lvl>
+    <w:lvl w:ilvl="6" w:tentative="1">
+      <w:start w:val="1"/>
+      <w:numFmt w:val="bullet"/>
+      <w:lvlText w:val=""/>
+      <w:lvlJc w:val="left"/>
+      <w:pPr>
+        <w:tabs>
+          <w:tab w:val="num" w:pos="5040"/>
+        </w:tabs>
+        <w:ind w:left="5040" w:hanging="360"/>
+      </w:pPr>
+      <w:rPr>
+        <w:rFonts w:ascii="Wingdings" w:hAnsi="Wingdings" w:hint="default"/>
+        <w:sz w:val="20"/>
+      </w:rPr>
+    </w:lvl>
+    <w:lvl w:ilvl="7" w:tentative="1">
+      <w:start w:val="1"/>
+      <w:numFmt w:val="bullet"/>
+      <w:lvlText w:val=""/>
+      <w:lvlJc w:val="left"/>
+      <w:pPr>
+        <w:tabs>
+          <w:tab w:val="num" w:pos="5760"/>
+        </w:tabs>
+        <w:ind w:left="5760" w:hanging="360"/>
+      </w:pPr>
+      <w:rPr>
+        <w:rFonts w:ascii="Wingdings" w:hAnsi="Wingdings" w:hint="default"/>
+        <w:sz w:val="20"/>
+      </w:rPr>
+    </w:lvl>
+    <w:lvl w:ilvl="8" w:tentative="1">
+      <w:start w:val="1"/>
+      <w:numFmt w:val="bullet"/>
+      <w:lvlText w:val=""/>
+      <w:lvlJc w:val="left"/>
+      <w:pPr>
+        <w:tabs>
+          <w:tab w:val="num" w:pos="6480"/>
+        </w:tabs>
+        <w:ind w:left="6480" w:hanging="360"/>
+      </w:pPr>
+      <w:rPr>
+        <w:rFonts w:ascii="Wingdings" w:hAnsi="Wingdings" w:hint="default"/>
+        <w:sz w:val="20"/>
+      </w:rPr>
+    </w:lvl>
+  </w:abstractNum>
+  <w:abstractNum w:abstractNumId="3" w15:restartNumberingAfterBreak="0">
     <w:nsid w:val="5D5C55B5"/>
     <w:multiLevelType w:val="hybridMultilevel"/>
     <w:tmpl w:val="A14EAA82"/>
@@ -4058,7 +4422,7 @@
       </w:rPr>
     </w:lvl>
   </w:abstractNum>
-  <w:abstractNum w:abstractNumId="3" w15:restartNumberingAfterBreak="0">
+  <w:abstractNum w:abstractNumId="4" w15:restartNumberingAfterBreak="0">
     <w:nsid w:val="7639296F"/>
     <w:multiLevelType w:val="hybridMultilevel"/>
     <w:tmpl w:val="7B9ED200"/>
@@ -4188,7 +4552,7 @@
     <w:abstractNumId w:val="0"/>
   </w:num>
   <w:num w:numId="5" w16cid:durableId="17052457">
-    <w:abstractNumId w:val="2"/>
+    <w:abstractNumId w:val="3"/>
   </w:num>
   <w:num w:numId="6" w16cid:durableId="1860193300">
     <w:abstractNumId w:val="0"/>
@@ -4209,16 +4573,19 @@
     <w:abstractNumId w:val="0"/>
   </w:num>
   <w:num w:numId="12" w16cid:durableId="829752184">
-    <w:abstractNumId w:val="3"/>
+    <w:abstractNumId w:val="4"/>
   </w:num>
   <w:num w:numId="13" w16cid:durableId="844396404">
-    <w:abstractNumId w:val="3"/>
+    <w:abstractNumId w:val="4"/>
   </w:num>
   <w:num w:numId="14" w16cid:durableId="91249389">
     <w:abstractNumId w:val="0"/>
   </w:num>
   <w:num w:numId="15" w16cid:durableId="956136198">
     <w:abstractNumId w:val="1"/>
+  </w:num>
+  <w:num w:numId="16" w16cid:durableId="444084307">
+    <w:abstractNumId w:val="2"/>
   </w:num>
 </w:numbering>
 </file>
@@ -4864,7 +5231,6 @@
   <w:style w:type="character" w:default="1" w:styleId="DefaultParagraphFont">
     <w:name w:val="Default Paragraph Font"/>
     <w:uiPriority w:val="1"/>
-    <w:semiHidden/>
     <w:unhideWhenUsed/>
   </w:style>
   <w:style w:type="table" w:default="1" w:styleId="TableNormal">

</xml_diff>